<commit_message>
checkpoint: Instrument Console UI + GSAP motion + speech-aligned copy
Preserves the v1 "Instrument Console" design (ink/bone palette, mono type,
GSAP boot sequence / count-up readouts / scroll reveals, smooth Leaflet
zoom) and speech-corrected copy, as a safe restore point before the v2
full-site redesign.

Co-Authored-By: Claude Opus 4.7 <noreply@anthropic.com>
</commit_message>
<xml_diff>
--- a/docs/speeches/tedx-aquanet.docx
+++ b/docs/speeches/tedx-aquanet.docx
@@ -139,28 +139,6 @@
     </w:p>
     <w:p>
       <w:pPr>
-        <w:pBdr>
-          <w:top w:val="single" w:sz="6" w:space="0" w:color="1A4F6A"/>
-          <w:bottom w:val="single" w:sz="6" w:space="0" w:color="1A4F6A"/>
-        </w:pBdr>
-        <w:spacing w:before="480" w:after="120"/>
-      </w:pPr>
-      <w:r>
-        <w:rPr>
-          <w:rFonts w:eastAsia="Arial"/>
-          <w:b/>
-          <w:bCs/>
-          <w:color w:val="1A4F6A"/>
-          <w:spacing w:val="60"/>
-          <w:sz w:val="22"/>
-          <w:szCs w:val="22"/>
-        </w:rPr>
-        <w:lastRenderedPageBreak/>
-        <w:t>OPENING  ·  THE POND AT PARK LANE HARBOUR  ·  ~2 minutes</w:t>
-      </w:r>
-    </w:p>
-    <w:p>
-      <w:pPr>
         <w:spacing w:before="120" w:after="120"/>
         <w:ind w:left="720"/>
       </w:pPr>
@@ -173,6 +151,7 @@
           <w:sz w:val="22"/>
           <w:szCs w:val="22"/>
         </w:rPr>
+        <w:lastRenderedPageBreak/>
         <w:t>[ Walk on stage. No slides yet. Stand still for two seconds before speaking. ]</w:t>
       </w:r>
     </w:p>
@@ -207,7 +186,19 @@
         <w:rPr>
           <w:rFonts w:eastAsia="Arial"/>
         </w:rPr>
-        <w:t xml:space="preserve"> — Park Lane Harbour. Where my school is. It's not a natural pond — some developer designed it about fifteen years ago when they built the apartment towers around it. It was probably supposed to be one of those </w:t>
+        <w:t xml:space="preserve"> — Park Lane Harbour, in </w:t>
+      </w:r>
+      <w:r>
+        <w:rPr>
+          <w:rFonts w:hint="eastAsia"/>
+        </w:rPr>
+        <w:t>惠州</w:t>
+      </w:r>
+      <w:r>
+        <w:rPr>
+          <w:rFonts w:eastAsia="Arial"/>
+        </w:rPr>
+        <w:t xml:space="preserve"> — Huizhou, about an hour east of Shenzhen. Where my school is. It’s not a natural pond — some developer designed it about fifteen years ago when they built the apartment towers around it. It was probably supposed to be one of those </w:t>
       </w:r>
       <w:r>
         <w:rPr>
@@ -361,30 +352,18 @@
         <w:rPr>
           <w:rFonts w:eastAsia="Arial"/>
         </w:rPr>
-        <w:t xml:space="preserve">hundred times. Maybe </w:t>
-      </w:r>
-      <w:r>
-        <w:rPr>
-          <w:rFonts w:eastAsia="Arial"/>
-        </w:rPr>
-        <w:t xml:space="preserve">eight </w:t>
-      </w:r>
-      <w:r>
-        <w:rPr>
-          <w:rFonts w:eastAsia="Arial"/>
-        </w:rPr>
-        <w:t>hundred.</w:t>
-      </w:r>
-    </w:p>
-    <w:p>
-      <w:pPr>
-        <w:spacing w:before="100" w:after="180" w:line="360" w:lineRule="auto"/>
-      </w:pPr>
-      <w:r>
-        <w:rPr>
-          <w:rFonts w:eastAsia="Arial"/>
-        </w:rPr>
-        <w:t>So have my classmates. So have the residents of those apartment towers. So have the cleaning staff and the security guards and the food delivery riders cutting through on their scooters. The pond is fifteen metres from a kindergarten classroom. Children look at it from their classroom windows.</w:t>
+        <w:t>hundred times. Maybe eight hundred.</w:t>
+      </w:r>
+    </w:p>
+    <w:p>
+      <w:pPr>
+        <w:spacing w:before="100" w:after="180" w:line="360" w:lineRule="auto"/>
+      </w:pPr>
+      <w:r>
+        <w:rPr>
+          <w:rFonts w:eastAsia="Arial"/>
+        </w:rPr>
+        <w:t>So have my classmates. So have the residents of those apartment towers. So have the cleaning staff and the security guards and the food delivery riders cutting through on their scooters. The pond is fifteen metres from a busy shopping street. Hundreds of people walk past it every day.</w:t>
       </w:r>
     </w:p>
     <w:p>
@@ -409,6 +388,10 @@
     <w:p>
       <w:pPr>
         <w:spacing w:before="100" w:after="180" w:line="360" w:lineRule="auto"/>
+        <w:rPr>
+          <w:rFonts w:ascii="Microsoft YaHei" w:eastAsia="Microsoft YaHei" w:hAnsi="Microsoft YaHei" w:cs="Microsoft YaHei" w:hint="eastAsia"/>
+          <w:lang w:val="en-US"/>
+        </w:rPr>
       </w:pPr>
       <w:r>
         <w:rPr>
@@ -443,6 +426,19 @@
           <w:rFonts w:eastAsia="Arial"/>
         </w:rPr>
         <w:t xml:space="preserve"> The question I couldn't stop thinking about was:</w:t>
+      </w:r>
+      <w:r>
+        <w:rPr>
+          <w:rFonts w:eastAsia="Arial" w:hint="eastAsia"/>
+        </w:rPr>
+        <w:t xml:space="preserve"> </w:t>
+      </w:r>
+      <w:r>
+        <w:rPr>
+          <w:rFonts w:ascii="Microsoft YaHei" w:eastAsia="Microsoft YaHei" w:hAnsi="Microsoft YaHei" w:cs="Microsoft YaHei" w:hint="eastAsia"/>
+          <w:lang w:val="en-US"/>
+        </w:rPr>
+        <w:t>【切】</w:t>
       </w:r>
     </w:p>
     <w:p>
@@ -481,45 +477,24 @@
     </w:p>
     <w:p>
       <w:pPr>
-        <w:pBdr>
-          <w:top w:val="single" w:sz="6" w:space="0" w:color="1A4F6A"/>
-          <w:bottom w:val="single" w:sz="6" w:space="0" w:color="1A4F6A"/>
-        </w:pBdr>
-        <w:spacing w:before="480" w:after="120"/>
-      </w:pPr>
-      <w:r>
-        <w:rPr>
-          <w:rFonts w:eastAsia="Arial"/>
-          <w:b/>
-          <w:bCs/>
-          <w:color w:val="1A4F6A"/>
-          <w:spacing w:val="60"/>
-          <w:sz w:val="22"/>
-          <w:szCs w:val="22"/>
+        <w:spacing w:before="100" w:after="180" w:line="360" w:lineRule="auto"/>
+      </w:pPr>
+      <w:r>
+        <w:rPr>
+          <w:rFonts w:eastAsia="Arial"/>
+        </w:rPr>
+        <w:t>I want to come back to that pond. But first I want to tell you something else.</w:t>
+      </w:r>
+    </w:p>
+    <w:p>
+      <w:pPr>
+        <w:spacing w:before="100" w:after="180" w:line="360" w:lineRule="auto"/>
+      </w:pPr>
+      <w:r>
+        <w:rPr>
+          <w:rFonts w:eastAsia="Arial"/>
         </w:rPr>
         <w:lastRenderedPageBreak/>
-        <w:t>BRIDGE TO HUNAN  ·  ~2 minutes</w:t>
-      </w:r>
-    </w:p>
-    <w:p>
-      <w:pPr>
-        <w:spacing w:before="100" w:after="180" w:line="360" w:lineRule="auto"/>
-      </w:pPr>
-      <w:r>
-        <w:rPr>
-          <w:rFonts w:eastAsia="Arial"/>
-        </w:rPr>
-        <w:t>I want to come back to that pond. But first I want to tell you something else.</w:t>
-      </w:r>
-    </w:p>
-    <w:p>
-      <w:pPr>
-        <w:spacing w:before="100" w:after="180" w:line="360" w:lineRule="auto"/>
-      </w:pPr>
-      <w:r>
-        <w:rPr>
-          <w:rFonts w:eastAsia="Arial"/>
-        </w:rPr>
         <w:t>The first dying water I remember wasn't actually that pond.</w:t>
       </w:r>
     </w:p>
@@ -647,6 +622,12 @@
       </w:r>
       <w:r>
         <w:rPr>
+          <w:rFonts w:ascii="Microsoft YaHei" w:eastAsia="Microsoft YaHei" w:hAnsi="Microsoft YaHei" w:cs="Microsoft YaHei" w:hint="eastAsia"/>
+        </w:rPr>
+        <w:t xml:space="preserve">【切】 </w:t>
+      </w:r>
+      <w:r>
+        <w:rPr>
           <w:rFonts w:eastAsia="Arial"/>
           <w:b/>
           <w:bCs/>
@@ -773,18 +754,18 @@
         <w:rPr>
           <w:rFonts w:eastAsia="Arial"/>
         </w:rPr>
+        <w:t>The Hunan river I can't reach from here — too far, too late, not my problem to fix.</w:t>
+      </w:r>
+    </w:p>
+    <w:p>
+      <w:pPr>
+        <w:spacing w:before="100" w:after="180" w:line="360" w:lineRule="auto"/>
+      </w:pPr>
+      <w:r>
+        <w:rPr>
+          <w:rFonts w:eastAsia="Arial"/>
+        </w:rPr>
         <w:lastRenderedPageBreak/>
-        <w:t>The Hunan river I can't reach from here — too far, too late, not my problem to fix.</w:t>
-      </w:r>
-    </w:p>
-    <w:p>
-      <w:pPr>
-        <w:spacing w:before="100" w:after="180" w:line="360" w:lineRule="auto"/>
-      </w:pPr>
-      <w:r>
-        <w:rPr>
-          <w:rFonts w:eastAsia="Arial"/>
-        </w:rPr>
         <w:t xml:space="preserve">And the green pond next to my school, which is </w:t>
       </w:r>
       <w:r>
@@ -835,39 +816,21 @@
     </w:p>
     <w:p>
       <w:pPr>
-        <w:pBdr>
-          <w:top w:val="single" w:sz="6" w:space="0" w:color="1A4F6A"/>
-          <w:bottom w:val="single" w:sz="6" w:space="0" w:color="1A4F6A"/>
-        </w:pBdr>
-        <w:spacing w:before="480" w:after="120"/>
-      </w:pPr>
-      <w:r>
-        <w:rPr>
-          <w:rFonts w:eastAsia="Arial"/>
-          <w:b/>
-          <w:bCs/>
-          <w:color w:val="1A4F6A"/>
-          <w:spacing w:val="60"/>
-          <w:sz w:val="22"/>
-          <w:szCs w:val="22"/>
-        </w:rPr>
-        <w:t>THE PROBLEM REFRAMED  ·  ~3 minutes</w:t>
-      </w:r>
-    </w:p>
-    <w:p>
-      <w:pPr>
-        <w:spacing w:before="100" w:after="180" w:line="360" w:lineRule="auto"/>
-      </w:pPr>
-      <w:r>
-        <w:rPr>
-          <w:rFonts w:eastAsia="Arial"/>
-        </w:rPr>
-        <w:t>So I asked: how would I even know if the pond was getting better, or worse, or staying the same? And it turned out — nobody knew. Not the property management. Not the city. Not the kindergarten teachers whose students look at it every day.</w:t>
-      </w:r>
-    </w:p>
-    <w:p>
-      <w:pPr>
-        <w:spacing w:before="100" w:after="180" w:line="360" w:lineRule="auto"/>
+        <w:spacing w:before="100" w:after="180" w:line="360" w:lineRule="auto"/>
+      </w:pPr>
+      <w:r>
+        <w:rPr>
+          <w:rFonts w:eastAsia="Arial"/>
+        </w:rPr>
+        <w:t>So I asked: how would I even know if the pond was getting better, or worse, or staying the same? And it turned out — nobody knew. Not the property management. Not the city. Not the shopkeepers whose customers walk past it every day.</w:t>
+      </w:r>
+    </w:p>
+    <w:p>
+      <w:pPr>
+        <w:spacing w:before="100" w:after="180" w:line="360" w:lineRule="auto"/>
+        <w:rPr>
+          <w:rFonts w:ascii="Microsoft YaHei" w:eastAsia="Microsoft YaHei" w:hAnsi="Microsoft YaHei" w:cs="Microsoft YaHei" w:hint="eastAsia"/>
+        </w:rPr>
       </w:pPr>
       <w:r>
         <w:rPr>
@@ -875,6 +838,18 @@
         </w:rPr>
         <w:t>Not because we don't have the science. We've known how to measure water quality for a hundred years. Three numbers tell you 80% of what you need to know: temperature, 酸碱度 — pH — and turbidity, how cloudy the water is.</w:t>
       </w:r>
+      <w:r>
+        <w:rPr>
+          <w:rFonts w:eastAsia="Arial" w:hint="eastAsia"/>
+        </w:rPr>
+        <w:t xml:space="preserve"> </w:t>
+      </w:r>
+      <w:r>
+        <w:rPr>
+          <w:rFonts w:ascii="Microsoft YaHei" w:eastAsia="Microsoft YaHei" w:hAnsi="Microsoft YaHei" w:cs="Microsoft YaHei" w:hint="eastAsia"/>
+        </w:rPr>
+        <w:t>【切】</w:t>
+      </w:r>
     </w:p>
     <w:p>
       <w:pPr>
@@ -910,27 +885,6 @@
           <w:rFonts w:eastAsia="Arial"/>
         </w:rPr>
         <w:t>.</w:t>
-      </w:r>
-    </w:p>
-    <w:p>
-      <w:pPr>
-        <w:pBdr>
-          <w:left w:val="single" w:sz="18" w:space="6" w:color="C7A03A"/>
-        </w:pBdr>
-        <w:shd w:val="clear" w:color="auto" w:fill="F4EEE2"/>
-        <w:spacing w:before="200" w:after="200"/>
-        <w:ind w:left="360"/>
-      </w:pPr>
-      <w:r>
-        <w:rPr>
-          <w:rFonts w:eastAsia="Arial"/>
-          <w:b/>
-          <w:bCs/>
-          <w:color w:val="8A6D1A"/>
-          <w:sz w:val="22"/>
-          <w:szCs w:val="22"/>
-        </w:rPr>
-        <w:t>SLIDE 1 — map of Shenzhen with the official government monitoring stations marked. (Verify the actual number before printing slides.)</w:t>
       </w:r>
     </w:p>
     <w:p>
@@ -1013,14 +967,7 @@
         <w:rPr>
           <w:rFonts w:eastAsia="Arial"/>
         </w:rPr>
-        <w:t xml:space="preserve">It disappears from your conversations. It disappears from your school field trips. It disappears from your grandfather's stories. And then one day you walk past it and it's </w:t>
-      </w:r>
-      <w:r>
-        <w:rPr>
-          <w:rFonts w:eastAsia="Arial"/>
-        </w:rPr>
-        <w:lastRenderedPageBreak/>
-        <w:t>green and it smells and you don't even know when it happened, because nobody was watching.</w:t>
+        <w:t>It disappears from your conversations. It disappears from your school field trips. It disappears from your grandfather's stories. And then one day you walk past it and it's green and it smells and you don't even know when it happened, because nobody was watching.</w:t>
       </w:r>
     </w:p>
     <w:p>
@@ -1042,27 +989,6 @@
     </w:p>
     <w:p>
       <w:pPr>
-        <w:pBdr>
-          <w:top w:val="single" w:sz="6" w:space="0" w:color="1A4F6A"/>
-          <w:bottom w:val="single" w:sz="6" w:space="0" w:color="1A4F6A"/>
-        </w:pBdr>
-        <w:spacing w:before="480" w:after="120"/>
-      </w:pPr>
-      <w:r>
-        <w:rPr>
-          <w:rFonts w:eastAsia="Arial"/>
-          <w:b/>
-          <w:bCs/>
-          <w:color w:val="1A4F6A"/>
-          <w:spacing w:val="60"/>
-          <w:sz w:val="22"/>
-          <w:szCs w:val="22"/>
-        </w:rPr>
-        <w:t>WHAT I'M BUILDING  ·  ~3 minutes</w:t>
-      </w:r>
-    </w:p>
-    <w:p>
-      <w:pPr>
         <w:spacing w:before="100" w:after="180" w:line="360" w:lineRule="auto"/>
       </w:pPr>
       <w:r>
@@ -1080,6 +1006,7 @@
         <w:rPr>
           <w:rFonts w:eastAsia="Arial"/>
         </w:rPr>
+        <w:lastRenderedPageBreak/>
         <w:t>For the last year, I've been building something.</w:t>
       </w:r>
     </w:p>
@@ -1091,7 +1018,19 @@
         <w:rPr>
           <w:rFonts w:eastAsia="Arial"/>
         </w:rPr>
-        <w:t xml:space="preserve">Tonight — as I'm standing here giving this talk — it </w:t>
+        <w:t>To</w:t>
+      </w:r>
+      <w:r>
+        <w:rPr>
+          <w:rFonts w:eastAsia="Arial"/>
+        </w:rPr>
+        <w:t>day</w:t>
+      </w:r>
+      <w:r>
+        <w:rPr>
+          <w:rFonts w:eastAsia="Arial"/>
+        </w:rPr>
+        <w:t xml:space="preserve"> — as I'm standing here giving this talk — it </w:t>
       </w:r>
       <w:r>
         <w:rPr>
@@ -1105,6 +1044,9 @@
     <w:p>
       <w:pPr>
         <w:spacing w:before="100" w:after="180" w:line="360" w:lineRule="auto"/>
+        <w:rPr>
+          <w:rFonts w:ascii="Microsoft YaHei" w:eastAsia="Microsoft YaHei" w:hAnsi="Microsoft YaHei" w:cs="Microsoft YaHei" w:hint="eastAsia"/>
+        </w:rPr>
       </w:pPr>
       <w:r>
         <w:rPr>
@@ -1112,26 +1054,17 @@
         </w:rPr>
         <w:t>I'm going to show it to you anyway. Because the most useful thing about a TEDx talk is not when somebody comes on stage and says "look what I did." It's when somebody comes on stage and says "look what I'm trying to do, before I know if it works."</w:t>
       </w:r>
-    </w:p>
-    <w:p>
-      <w:pPr>
-        <w:pBdr>
-          <w:left w:val="single" w:sz="18" w:space="6" w:color="C7A03A"/>
-        </w:pBdr>
-        <w:shd w:val="clear" w:color="auto" w:fill="F4EEE2"/>
-        <w:spacing w:before="200" w:after="200"/>
-        <w:ind w:left="360"/>
-      </w:pPr>
-      <w:r>
-        <w:rPr>
-          <w:rFonts w:eastAsia="Arial"/>
-          <w:b/>
-          <w:bCs/>
-          <w:color w:val="8A6D1A"/>
-          <w:sz w:val="22"/>
-          <w:szCs w:val="22"/>
-        </w:rPr>
-        <w:t>SLIDE 2 — Blender render of the yellow buoy (hero shot).</w:t>
+      <w:r>
+        <w:rPr>
+          <w:rFonts w:eastAsia="Arial" w:hint="eastAsia"/>
+        </w:rPr>
+        <w:t xml:space="preserve"> </w:t>
+      </w:r>
+      <w:r>
+        <w:rPr>
+          <w:rFonts w:ascii="Microsoft YaHei" w:eastAsia="Microsoft YaHei" w:hAnsi="Microsoft YaHei" w:cs="Microsoft YaHei" w:hint="eastAsia"/>
+        </w:rPr>
+        <w:t>【切】</w:t>
       </w:r>
     </w:p>
     <w:p>
@@ -1176,6 +1109,9 @@
     <w:p>
       <w:pPr>
         <w:spacing w:before="100" w:after="180" w:line="360" w:lineRule="auto"/>
+        <w:rPr>
+          <w:rFonts w:eastAsia="Arial"/>
+        </w:rPr>
       </w:pPr>
       <w:r>
         <w:rPr>
@@ -1195,28 +1131,33 @@
         <w:rPr>
           <w:rFonts w:eastAsia="Arial"/>
         </w:rPr>
-        <w:t xml:space="preserve"> microcontroller — a tiny computer the size of a thumb — three sensors that read temperature, pH, and turbidity, a solar panel, a WiFi antenna, and a single 18650 battery. Every five minutes it wakes up, sticks its sensors in the water, and texts the readings to a website.</w:t>
-      </w:r>
-    </w:p>
-    <w:p>
-      <w:pPr>
-        <w:pBdr>
-          <w:left w:val="single" w:sz="18" w:space="6" w:color="C7A03A"/>
-        </w:pBdr>
-        <w:shd w:val="clear" w:color="auto" w:fill="F4EEE2"/>
-        <w:spacing w:before="200" w:after="200"/>
-        <w:ind w:left="360"/>
-      </w:pPr>
-      <w:r>
-        <w:rPr>
-          <w:rFonts w:eastAsia="Arial"/>
-          <w:b/>
-          <w:bCs/>
-          <w:color w:val="8A6D1A"/>
-          <w:sz w:val="22"/>
-          <w:szCs w:val="22"/>
-        </w:rPr>
-        <w:t>SLIDE 3 — screenshot of the AquaNet website (or live URL on stage if WiFi is reliable).</w:t>
+        <w:t xml:space="preserve"> microcontroller — a tiny computer the size of a thumb — three sensors that read temperature, pH, and turbidity, a solar panel, a WiFi antenna, and a single </w:t>
+      </w:r>
+      <w:r>
+        <w:rPr>
+          <w:rFonts w:eastAsia="Arial" w:hint="eastAsia"/>
+        </w:rPr>
+        <w:t>lithium</w:t>
+      </w:r>
+      <w:r>
+        <w:rPr>
+          <w:rFonts w:eastAsia="Arial"/>
+        </w:rPr>
+        <w:t xml:space="preserve"> battery. Every five minutes it wakes up, sticks its sensors in the water, and texts the readings to a website.</w:t>
+      </w:r>
+    </w:p>
+    <w:p>
+      <w:pPr>
+        <w:spacing w:before="100" w:after="180" w:line="360" w:lineRule="auto"/>
+        <w:rPr>
+          <w:rFonts w:ascii="Microsoft YaHei" w:eastAsia="Microsoft YaHei" w:hAnsi="Microsoft YaHei" w:cs="Microsoft YaHei" w:hint="eastAsia"/>
+        </w:rPr>
+      </w:pPr>
+      <w:r>
+        <w:rPr>
+          <w:rFonts w:ascii="Microsoft YaHei" w:eastAsia="Microsoft YaHei" w:hAnsi="Microsoft YaHei" w:cs="Microsoft YaHei" w:hint="eastAsia"/>
+        </w:rPr>
+        <w:t>【切】</w:t>
       </w:r>
     </w:p>
     <w:p>
@@ -1336,80 +1277,80 @@
         <w:rPr>
           <w:rFonts w:eastAsia="Arial"/>
         </w:rPr>
+        <w:t xml:space="preserve">And in </w:t>
+      </w:r>
+      <w:r>
+        <w:rPr>
+          <w:rFonts w:eastAsia="Arial"/>
+          <w:b/>
+          <w:bCs/>
+        </w:rPr>
+        <w:t>about 25 days</w:t>
+      </w:r>
+      <w:r>
+        <w:rPr>
+          <w:rFonts w:eastAsia="Arial"/>
+        </w:rPr>
+        <w:t>, I'm going to put the first buoy in the pond next to my school.</w:t>
+      </w:r>
+    </w:p>
+    <w:p>
+      <w:pPr>
+        <w:spacing w:before="100" w:after="180" w:line="360" w:lineRule="auto"/>
+      </w:pPr>
+      <w:r>
+        <w:rPr>
+          <w:rFonts w:eastAsia="Arial"/>
+        </w:rPr>
+        <w:t xml:space="preserve">Not in a lab. Not on a test bench. In the actual green eutrophic pond at </w:t>
+      </w:r>
+      <w:r>
+        <w:rPr>
+          <w:rFonts w:ascii="Microsoft YaHei" w:eastAsia="Microsoft YaHei" w:hAnsi="Microsoft YaHei" w:cs="Microsoft YaHei" w:hint="eastAsia"/>
+        </w:rPr>
+        <w:t>小径湾</w:t>
+      </w:r>
+      <w:r>
+        <w:rPr>
+          <w:rFonts w:eastAsia="Arial"/>
+        </w:rPr>
+        <w:t xml:space="preserve">. By the </w:t>
+      </w:r>
+      <w:r>
+        <w:rPr>
+          <w:rFonts w:eastAsia="Arial"/>
+          <w:b/>
+          <w:bCs/>
+        </w:rPr>
+        <w:t>middle of June</w:t>
+      </w:r>
+      <w:r>
+        <w:rPr>
+          <w:rFonts w:eastAsia="Arial"/>
+        </w:rPr>
+        <w:t>. It will be the first buoy in the water.</w:t>
+      </w:r>
+    </w:p>
+    <w:p>
+      <w:pPr>
+        <w:spacing w:before="100" w:after="180" w:line="360" w:lineRule="auto"/>
+      </w:pPr>
+      <w:r>
+        <w:rPr>
+          <w:rFonts w:eastAsia="Arial"/>
+        </w:rPr>
+        <w:t>If it works, the readings will start showing up on the website. Anybody in this room will be able to look up, from their phone, whether the pond outside my school is doing better or worse than the day before.</w:t>
+      </w:r>
+    </w:p>
+    <w:p>
+      <w:pPr>
+        <w:spacing w:before="100" w:after="180" w:line="360" w:lineRule="auto"/>
+      </w:pPr>
+      <w:r>
+        <w:rPr>
+          <w:rFonts w:eastAsia="Arial"/>
+        </w:rPr>
         <w:lastRenderedPageBreak/>
-        <w:t xml:space="preserve">And in </w:t>
-      </w:r>
-      <w:r>
-        <w:rPr>
-          <w:rFonts w:eastAsia="Arial"/>
-          <w:b/>
-          <w:bCs/>
-        </w:rPr>
-        <w:t>about 25 days</w:t>
-      </w:r>
-      <w:r>
-        <w:rPr>
-          <w:rFonts w:eastAsia="Arial"/>
-        </w:rPr>
-        <w:t>, I'm going to put the first buoy in the pond next to my school.</w:t>
-      </w:r>
-    </w:p>
-    <w:p>
-      <w:pPr>
-        <w:spacing w:before="100" w:after="180" w:line="360" w:lineRule="auto"/>
-      </w:pPr>
-      <w:r>
-        <w:rPr>
-          <w:rFonts w:eastAsia="Arial"/>
-        </w:rPr>
-        <w:t xml:space="preserve">Not in a lab. Not on a test bench. In the actual green eutrophic pond at </w:t>
-      </w:r>
-      <w:r>
-        <w:rPr>
-          <w:rFonts w:ascii="Microsoft YaHei" w:eastAsia="Microsoft YaHei" w:hAnsi="Microsoft YaHei" w:cs="Microsoft YaHei" w:hint="eastAsia"/>
-        </w:rPr>
-        <w:t>小径湾</w:t>
-      </w:r>
-      <w:r>
-        <w:rPr>
-          <w:rFonts w:eastAsia="Arial"/>
-        </w:rPr>
-        <w:t xml:space="preserve">. By the </w:t>
-      </w:r>
-      <w:r>
-        <w:rPr>
-          <w:rFonts w:eastAsia="Arial"/>
-          <w:b/>
-          <w:bCs/>
-        </w:rPr>
-        <w:t>middle of June</w:t>
-      </w:r>
-      <w:r>
-        <w:rPr>
-          <w:rFonts w:eastAsia="Arial"/>
-        </w:rPr>
-        <w:t>. It will be the first buoy in the water.</w:t>
-      </w:r>
-    </w:p>
-    <w:p>
-      <w:pPr>
-        <w:spacing w:before="100" w:after="180" w:line="360" w:lineRule="auto"/>
-      </w:pPr>
-      <w:r>
-        <w:rPr>
-          <w:rFonts w:eastAsia="Arial"/>
-        </w:rPr>
-        <w:t>If it works, the readings will start showing up on the website. Anybody in this room will be able to look up, from their phone, whether the pond outside my school is doing better or worse than the day before.</w:t>
-      </w:r>
-    </w:p>
-    <w:p>
-      <w:pPr>
-        <w:spacing w:before="100" w:after="180" w:line="360" w:lineRule="auto"/>
-      </w:pPr>
-      <w:r>
-        <w:rPr>
-          <w:rFonts w:eastAsia="Arial"/>
-        </w:rPr>
         <w:t xml:space="preserve">Right now, that is information that </w:t>
       </w:r>
       <w:r>
@@ -1471,27 +1412,6 @@
     </w:p>
     <w:p>
       <w:pPr>
-        <w:pBdr>
-          <w:top w:val="single" w:sz="6" w:space="0" w:color="1A4F6A"/>
-          <w:bottom w:val="single" w:sz="6" w:space="0" w:color="1A4F6A"/>
-        </w:pBdr>
-        <w:spacing w:before="480" w:after="120"/>
-      </w:pPr>
-      <w:r>
-        <w:rPr>
-          <w:rFonts w:eastAsia="Arial"/>
-          <w:b/>
-          <w:bCs/>
-          <w:color w:val="1A4F6A"/>
-          <w:spacing w:val="60"/>
-          <w:sz w:val="22"/>
-          <w:szCs w:val="22"/>
-        </w:rPr>
-        <w:t>WHY I'M TELLING YOU NOW  ·  ~2 minutes</w:t>
-      </w:r>
-    </w:p>
-    <w:p>
-      <w:pPr>
         <w:spacing w:before="100" w:after="180" w:line="360" w:lineRule="auto"/>
       </w:pPr>
       <w:r>
@@ -1617,14 +1537,7 @@
         <w:rPr>
           <w:rFonts w:eastAsia="Arial"/>
         </w:rPr>
-        <w:t xml:space="preserve">If you only ever hear from the people who've already succeeded, you'll think you can't try yourself. So I'd rather come here with a half-built thing and an honest plan, than wait </w:t>
-      </w:r>
-      <w:r>
-        <w:rPr>
-          <w:rFonts w:eastAsia="Arial"/>
-        </w:rPr>
-        <w:lastRenderedPageBreak/>
-        <w:t>two years and come back with a polished story that quietly leaves out everything that broke.</w:t>
+        <w:t>If you only ever hear from the people who've already succeeded, you'll think you can't try yourself. So I'd rather come here with a half-built thing and an honest plan, than wait two years and come back with a polished story that quietly leaves out everything that broke.</w:t>
       </w:r>
     </w:p>
     <w:p>
@@ -1693,6 +1606,7 @@
         <w:rPr>
           <w:rFonts w:eastAsia="Arial"/>
         </w:rPr>
+        <w:lastRenderedPageBreak/>
         <w:t xml:space="preserve">The buoy is a </w:t>
       </w:r>
       <w:r>
@@ -1748,27 +1662,6 @@
     </w:p>
     <w:p>
       <w:pPr>
-        <w:pBdr>
-          <w:top w:val="single" w:sz="6" w:space="0" w:color="1A4F6A"/>
-          <w:bottom w:val="single" w:sz="6" w:space="0" w:color="1A4F6A"/>
-        </w:pBdr>
-        <w:spacing w:before="480" w:after="120"/>
-      </w:pPr>
-      <w:r>
-        <w:rPr>
-          <w:rFonts w:eastAsia="Arial"/>
-          <w:b/>
-          <w:bCs/>
-          <w:color w:val="1A4F6A"/>
-          <w:spacing w:val="60"/>
-          <w:sz w:val="22"/>
-          <w:szCs w:val="22"/>
-        </w:rPr>
-        <w:t>CLOSING  ·  TWO DISTANCES  ·  ~2 minutes</w:t>
-      </w:r>
-    </w:p>
-    <w:p>
-      <w:pPr>
         <w:spacing w:before="100" w:after="180" w:line="360" w:lineRule="auto"/>
       </w:pPr>
       <w:r>
@@ -1875,119 +1768,103 @@
         <w:rPr>
           <w:rFonts w:eastAsia="Arial"/>
         </w:rPr>
-        <w:t xml:space="preserve"> — 一千公里以外的 老家. A thousand kilometres back home. We send 红包 home for 春节. We WeChat-call </w:t>
-      </w:r>
+        <w:t xml:space="preserve"> — 一千公里以外的 老家. A thousand kilometres back home. We send 红包 home for 春节. We WeChat-call grandma on Sundays. But the river behind her village — nobody's watching it. The whole village got on the train to Shenzhen.</w:t>
+      </w:r>
+    </w:p>
+    <w:p>
+      <w:pPr>
+        <w:spacing w:before="100" w:after="180" w:line="360" w:lineRule="auto"/>
+      </w:pPr>
+      <w:r>
+        <w:rPr>
+          <w:rFonts w:eastAsia="Arial"/>
+        </w:rPr>
+        <w:t>I can't close that distance. The Hunan river behind my grandfather's village will probably keep getting worse, and there's nothing I can do about it from here.</w:t>
+      </w:r>
+    </w:p>
+    <w:p>
+      <w:pPr>
+        <w:spacing w:before="100" w:after="180" w:line="360" w:lineRule="auto"/>
+      </w:pPr>
+      <w:r>
+        <w:rPr>
+          <w:rFonts w:eastAsia="Arial"/>
+        </w:rPr>
+        <w:t xml:space="preserve">But I realised — </w:t>
+      </w:r>
+      <w:r>
+        <w:rPr>
+          <w:rFonts w:eastAsia="Arial"/>
+          <w:b/>
+          <w:bCs/>
+        </w:rPr>
+        <w:t>I can close the local one.</w:t>
+      </w:r>
+    </w:p>
+    <w:p>
+      <w:pPr>
+        <w:spacing w:before="100" w:after="180" w:line="360" w:lineRule="auto"/>
+      </w:pPr>
+      <w:r>
+        <w:rPr>
+          <w:rFonts w:eastAsia="Arial"/>
+        </w:rPr>
+        <w:t xml:space="preserve">The pond at </w:t>
+      </w:r>
+      <w:r>
+        <w:rPr>
+          <w:rFonts w:ascii="Microsoft YaHei" w:eastAsia="Microsoft YaHei" w:hAnsi="Microsoft YaHei" w:cs="Microsoft YaHei" w:hint="eastAsia"/>
+        </w:rPr>
+        <w:t>小径湾</w:t>
+      </w:r>
+      <w:r>
+        <w:rPr>
+          <w:rFonts w:eastAsia="Arial"/>
+        </w:rPr>
+        <w:t xml:space="preserve"> is fifteen metres from a </w:t>
+      </w:r>
+      <w:r>
+        <w:rPr>
+          <w:rFonts w:eastAsia="Arial" w:hint="eastAsia"/>
+        </w:rPr>
+        <w:t>shopp</w:t>
+      </w:r>
+      <w:r>
+        <w:rPr>
+          <w:rFonts w:eastAsia="Arial"/>
+        </w:rPr>
+        <w:t>ing street</w:t>
+      </w:r>
+      <w:r>
+        <w:rPr>
+          <w:rFonts w:eastAsia="Arial"/>
+        </w:rPr>
+        <w:t xml:space="preserve">. By </w:t>
+      </w:r>
+      <w:r>
+        <w:rPr>
+          <w:rFonts w:eastAsia="Arial"/>
+          <w:b/>
+          <w:bCs/>
+        </w:rPr>
+        <w:t>mid-June</w:t>
+      </w:r>
+      <w:r>
+        <w:rPr>
+          <w:rFonts w:eastAsia="Arial"/>
+        </w:rPr>
+        <w:t>, it will have somebody watching it.</w:t>
+      </w:r>
+    </w:p>
+    <w:p>
+      <w:pPr>
+        <w:spacing w:before="100" w:after="180" w:line="360" w:lineRule="auto"/>
+      </w:pPr>
       <w:r>
         <w:rPr>
           <w:rFonts w:eastAsia="Arial"/>
         </w:rPr>
         <w:lastRenderedPageBreak/>
-        <w:t>grandma on Sundays. But the river behind her village — nobody's watching it. The whole village got on the train to Shenzhen.</w:t>
-      </w:r>
-    </w:p>
-    <w:p>
-      <w:pPr>
-        <w:spacing w:before="100" w:after="180" w:line="360" w:lineRule="auto"/>
-      </w:pPr>
-      <w:r>
-        <w:rPr>
-          <w:rFonts w:eastAsia="Arial"/>
-        </w:rPr>
-        <w:t>I can't close that distance. The Hunan river behind my grandfather's village will probably keep getting worse, and there's nothing I can do about it from here.</w:t>
-      </w:r>
-    </w:p>
-    <w:p>
-      <w:pPr>
-        <w:spacing w:before="100" w:after="180" w:line="360" w:lineRule="auto"/>
-      </w:pPr>
-      <w:r>
-        <w:rPr>
-          <w:rFonts w:eastAsia="Arial"/>
-        </w:rPr>
-        <w:t xml:space="preserve">But I realised — </w:t>
-      </w:r>
-      <w:r>
-        <w:rPr>
-          <w:rFonts w:eastAsia="Arial"/>
-          <w:b/>
-          <w:bCs/>
-        </w:rPr>
-        <w:t>I can close the local one.</w:t>
-      </w:r>
-    </w:p>
-    <w:p>
-      <w:pPr>
-        <w:spacing w:before="100" w:after="180" w:line="360" w:lineRule="auto"/>
-      </w:pPr>
-      <w:r>
-        <w:rPr>
-          <w:rFonts w:eastAsia="Arial"/>
-        </w:rPr>
-        <w:t xml:space="preserve">The pond at </w:t>
-      </w:r>
-      <w:r>
-        <w:rPr>
-          <w:rFonts w:ascii="Microsoft YaHei" w:eastAsia="Microsoft YaHei" w:hAnsi="Microsoft YaHei" w:cs="Microsoft YaHei" w:hint="eastAsia"/>
-        </w:rPr>
-        <w:t>小径湾</w:t>
-      </w:r>
-      <w:r>
-        <w:rPr>
-          <w:rFonts w:eastAsia="Arial"/>
-        </w:rPr>
-        <w:t xml:space="preserve"> is fifteen metres from a </w:t>
-      </w:r>
-      <w:r>
-        <w:rPr>
-          <w:rFonts w:eastAsia="Arial" w:hint="eastAsia"/>
-        </w:rPr>
-        <w:t>shopp</w:t>
-      </w:r>
-      <w:proofErr w:type="spellStart"/>
-      <w:r>
-        <w:rPr>
-          <w:rFonts w:eastAsia="Arial"/>
-          <w:lang w:val="en-US"/>
-        </w:rPr>
-        <w:t>ing</w:t>
-      </w:r>
-      <w:proofErr w:type="spellEnd"/>
-      <w:r>
-        <w:rPr>
-          <w:rFonts w:eastAsia="Arial"/>
-          <w:lang w:val="en-US"/>
-        </w:rPr>
-        <w:t xml:space="preserve"> street</w:t>
-      </w:r>
-      <w:r>
-        <w:rPr>
-          <w:rFonts w:eastAsia="Arial"/>
-        </w:rPr>
-        <w:t xml:space="preserve">. By </w:t>
-      </w:r>
-      <w:r>
-        <w:rPr>
-          <w:rFonts w:eastAsia="Arial"/>
-          <w:b/>
-          <w:bCs/>
-        </w:rPr>
-        <w:t>mid-June</w:t>
-      </w:r>
-      <w:r>
-        <w:rPr>
-          <w:rFonts w:eastAsia="Arial"/>
-        </w:rPr>
-        <w:t>, it will have somebody watching it.</w:t>
-      </w:r>
-    </w:p>
-    <w:p>
-      <w:pPr>
-        <w:spacing w:before="100" w:after="180" w:line="360" w:lineRule="auto"/>
-      </w:pPr>
-      <w:r>
-        <w:rPr>
-          <w:rFonts w:eastAsia="Arial"/>
-        </w:rPr>
         <w:t>That somebody is me. And then it's whoever pulls out their phone next time they walk past, and checks the readings, and notices that the pH spiked on Tuesday, and goes home and tells someone.</w:t>
       </w:r>
     </w:p>
@@ -2129,7 +2006,7 @@
         <w:rPr>
           <w:rFonts w:eastAsia="Arial"/>
         </w:rPr>
-        <w:t xml:space="preserve">But there's a pond fifteen metres from a kindergarten in </w:t>
+        <w:t xml:space="preserve">But there's a pond fifteen metres from a shopping street in </w:t>
       </w:r>
       <w:r>
         <w:rPr>
@@ -2166,7 +2043,6 @@
         <w:rPr>
           <w:rFonts w:eastAsia="Arial"/>
         </w:rPr>
-        <w:lastRenderedPageBreak/>
         <w:t xml:space="preserve">And maybe in twenty years, when somebody's child walks past that pond on their way to school, the water won't be green anymore. Not because the government saved it. Because </w:t>
       </w:r>
       <w:r>
@@ -2181,12 +2057,29 @@
     <w:p>
       <w:pPr>
         <w:spacing w:before="100" w:after="180" w:line="360" w:lineRule="auto"/>
+        <w:rPr>
+          <w:rFonts w:eastAsia="Arial"/>
+        </w:rPr>
       </w:pPr>
       <w:r>
         <w:rPr>
           <w:rFonts w:eastAsia="Arial"/>
         </w:rPr>
         <w:t>That somebody can be you.</w:t>
+      </w:r>
+    </w:p>
+    <w:p>
+      <w:pPr>
+        <w:spacing w:before="100" w:after="180" w:line="360" w:lineRule="auto"/>
+        <w:rPr>
+          <w:rFonts w:ascii="Microsoft YaHei" w:eastAsia="Microsoft YaHei" w:hAnsi="Microsoft YaHei" w:cs="Microsoft YaHei" w:hint="eastAsia"/>
+        </w:rPr>
+      </w:pPr>
+      <w:r>
+        <w:rPr>
+          <w:rFonts w:ascii="Microsoft YaHei" w:eastAsia="Microsoft YaHei" w:hAnsi="Microsoft YaHei" w:cs="Microsoft YaHei" w:hint="eastAsia"/>
+        </w:rPr>
+        <w:t>【切】</w:t>
       </w:r>
     </w:p>
     <w:p>
@@ -2231,6 +2124,7 @@
           <w:sz w:val="32"/>
           <w:szCs w:val="32"/>
         </w:rPr>
+        <w:lastRenderedPageBreak/>
         <w:t>disappears.</w:t>
       </w:r>
     </w:p>

</xml_diff>